<commit_message>
ajout des version document word
</commit_message>
<xml_diff>
--- a/documents/documents_word/documentation_projet_m431_v2.docx
+++ b/documents/documents_word/documentation_projet_m431_v2.docx
@@ -1164,7 +1164,7 @@
           <w:r>
             <w:fldChar w:fldCharType="separate"/>
           </w:r>
-          <w:hyperlink w:anchor="_Toc226009404" w:history="1">
+          <w:hyperlink w:anchor="_Toc226010234" w:history="1">
             <w:r>
               <w:rPr>
                 <w:rStyle w:val="Lienhypertexte"/>
@@ -1191,7 +1191,7 @@
                 <w:noProof/>
                 <w:webHidden/>
               </w:rPr>
-              <w:instrText xml:space="preserve"> PAGEREF _Toc226009404 \h </w:instrText>
+              <w:instrText xml:space="preserve"> PAGEREF _Toc226010234 \h </w:instrText>
             </w:r>
             <w:r>
               <w:rPr>
@@ -1237,7 +1237,7 @@
               <w:lang w:eastAsia="fr-FR"/>
             </w:rPr>
           </w:pPr>
-          <w:hyperlink w:anchor="_Toc226009405" w:history="1">
+          <w:hyperlink w:anchor="_Toc226010235" w:history="1">
             <w:r>
               <w:rPr>
                 <w:rStyle w:val="Lienhypertexte"/>
@@ -1264,7 +1264,7 @@
                 <w:noProof/>
                 <w:webHidden/>
               </w:rPr>
-              <w:instrText xml:space="preserve"> PAGEREF _Toc226009405 \h </w:instrText>
+              <w:instrText xml:space="preserve"> PAGEREF _Toc226010235 \h </w:instrText>
             </w:r>
             <w:r>
               <w:rPr>
@@ -1312,7 +1312,7 @@
               <w:lang w:eastAsia="fr-FR"/>
             </w:rPr>
           </w:pPr>
-          <w:hyperlink w:anchor="_Toc226009406" w:history="1">
+          <w:hyperlink w:anchor="_Toc226010236" w:history="1">
             <w:r>
               <w:rPr>
                 <w:rStyle w:val="Lienhypertexte"/>
@@ -1340,7 +1340,7 @@
                 <w:noProof/>
                 <w:webHidden/>
               </w:rPr>
-              <w:instrText xml:space="preserve"> PAGEREF _Toc226009406 \h </w:instrText>
+              <w:instrText xml:space="preserve"> PAGEREF _Toc226010236 \h </w:instrText>
             </w:r>
             <w:r>
               <w:rPr>
@@ -1388,7 +1388,7 @@
               <w:lang w:eastAsia="fr-FR"/>
             </w:rPr>
           </w:pPr>
-          <w:hyperlink w:anchor="_Toc226009407" w:history="1">
+          <w:hyperlink w:anchor="_Toc226010237" w:history="1">
             <w:r>
               <w:rPr>
                 <w:rStyle w:val="Lienhypertexte"/>
@@ -1416,7 +1416,7 @@
                 <w:noProof/>
                 <w:webHidden/>
               </w:rPr>
-              <w:instrText xml:space="preserve"> PAGEREF _Toc226009407 \h </w:instrText>
+              <w:instrText xml:space="preserve"> PAGEREF _Toc226010237 \h </w:instrText>
             </w:r>
             <w:r>
               <w:rPr>
@@ -1464,7 +1464,7 @@
               <w:lang w:eastAsia="fr-FR"/>
             </w:rPr>
           </w:pPr>
-          <w:hyperlink w:anchor="_Toc226009408" w:history="1">
+          <w:hyperlink w:anchor="_Toc226010238" w:history="1">
             <w:r>
               <w:rPr>
                 <w:rStyle w:val="Lienhypertexte"/>
@@ -1491,7 +1491,7 @@
                 <w:noProof/>
                 <w:webHidden/>
               </w:rPr>
-              <w:instrText xml:space="preserve"> PAGEREF _Toc226009408 \h </w:instrText>
+              <w:instrText xml:space="preserve"> PAGEREF _Toc226010238 \h </w:instrText>
             </w:r>
             <w:r>
               <w:rPr>
@@ -1552,7 +1552,7 @@
         <w:pStyle w:val="Titre1"/>
       </w:pPr>
       <w:bookmarkStart w:id="0" w:name="_Toc225408742"/>
-      <w:bookmarkStart w:id="1" w:name="_Toc226009404"/>
+      <w:bookmarkStart w:id="1" w:name="_Toc226010234"/>
       <w:r>
         <w:lastRenderedPageBreak/>
         <w:t>1.Description du projet</w:t>
@@ -1565,7 +1565,7 @@
         <w:pStyle w:val="Titre2"/>
       </w:pPr>
       <w:bookmarkStart w:id="2" w:name="_Toc225408743"/>
-      <w:bookmarkStart w:id="3" w:name="_Toc226009405"/>
+      <w:bookmarkStart w:id="3" w:name="_Toc226010235"/>
       <w:r>
         <w:t>1.1 Objectif</w:t>
       </w:r>
@@ -1936,7 +1936,7 @@
         </w:rPr>
       </w:pPr>
       <w:bookmarkStart w:id="4" w:name="_Toc225408744"/>
-      <w:bookmarkStart w:id="5" w:name="_Toc226009406"/>
+      <w:bookmarkStart w:id="5" w:name="_Toc226010236"/>
       <w:r>
         <w:rPr>
           <w:lang w:eastAsia="fr-CH"/>
@@ -2033,7 +2033,7 @@
         </w:rPr>
       </w:pPr>
       <w:bookmarkStart w:id="6" w:name="_Toc225408745"/>
-      <w:bookmarkStart w:id="7" w:name="_Toc226009407"/>
+      <w:bookmarkStart w:id="7" w:name="_Toc226010237"/>
       <w:r>
         <w:rPr>
           <w:lang w:eastAsia="fr-CH"/>
@@ -2229,7 +2229,7 @@
         <w:pStyle w:val="Titre1"/>
       </w:pPr>
       <w:bookmarkStart w:id="8" w:name="_Toc225408746"/>
-      <w:bookmarkStart w:id="9" w:name="_Toc226009408"/>
+      <w:bookmarkStart w:id="9" w:name="_Toc226010238"/>
       <w:r>
         <w:t>4.Méthode des 6 étapes</w:t>
       </w:r>
@@ -2240,11 +2240,9 @@
       <w:r>
         <w:t xml:space="preserve">Voici </w:t>
       </w:r>
-      <w:proofErr w:type="gramStart"/>
-      <w:r>
-        <w:t>la méthodes</w:t>
-      </w:r>
-      <w:proofErr w:type="gramEnd"/>
+      <w:r>
+        <w:t>la méthode</w:t>
+      </w:r>
       <w:r>
         <w:t xml:space="preserve"> des 6 étapes en lien avec notre projet.</w:t>
       </w:r>
@@ -2261,91 +2259,99 @@
         </w:rPr>
       </w:pPr>
       <w:proofErr w:type="spellStart"/>
-      <w:proofErr w:type="gramStart"/>
       <w:r>
         <w:rPr>
           <w:lang w:val="de-CH"/>
         </w:rPr>
-        <w:t>Planifer</w:t>
+        <w:t>Planif</w:t>
+      </w:r>
+      <w:r>
+        <w:rPr>
+          <w:lang w:val="de-CH"/>
+        </w:rPr>
+        <w:t>i</w:t>
+      </w:r>
+      <w:r>
+        <w:rPr>
+          <w:lang w:val="de-CH"/>
+        </w:rPr>
+        <w:t>er</w:t>
       </w:r>
       <w:proofErr w:type="spellEnd"/>
       <w:r>
         <w:rPr>
           <w:lang w:val="de-CH"/>
         </w:rPr>
-        <w:t> :</w:t>
-      </w:r>
-      <w:proofErr w:type="gramEnd"/>
+        <w:t xml:space="preserve"> : </w:t>
+      </w:r>
+      <w:proofErr w:type="spellStart"/>
       <w:r>
         <w:rPr>
           <w:lang w:val="de-CH"/>
         </w:rPr>
+        <w:t>diagramme</w:t>
+      </w:r>
+      <w:proofErr w:type="spellEnd"/>
+      <w:r>
+        <w:rPr>
+          <w:lang w:val="de-CH"/>
+        </w:rPr>
         <w:t xml:space="preserve"> </w:t>
       </w:r>
-      <w:proofErr w:type="spellStart"/>
       <w:r>
         <w:rPr>
           <w:lang w:val="de-CH"/>
         </w:rPr>
-        <w:t>diagramme</w:t>
-      </w:r>
-      <w:proofErr w:type="spellEnd"/>
+        <w:t>Gant</w:t>
+      </w:r>
       <w:r>
         <w:rPr>
           <w:lang w:val="de-CH"/>
         </w:rPr>
+        <w:t>t,</w:t>
+      </w:r>
+      <w:r>
+        <w:rPr>
+          <w:lang w:val="de-CH"/>
+        </w:rPr>
         <w:t xml:space="preserve"> </w:t>
       </w:r>
-      <w:proofErr w:type="spellStart"/>
       <w:r>
         <w:rPr>
           <w:lang w:val="de-CH"/>
         </w:rPr>
-        <w:t>gantt</w:t>
-      </w:r>
-      <w:proofErr w:type="spellEnd"/>
+        <w:t>Kanban</w:t>
+      </w:r>
       <w:r>
         <w:rPr>
           <w:lang w:val="de-CH"/>
         </w:rPr>
-        <w:t xml:space="preserve"> </w:t>
-      </w:r>
-      <w:proofErr w:type="spellStart"/>
+        <w:t xml:space="preserve"> (</w:t>
+      </w:r>
       <w:r>
         <w:rPr>
           <w:lang w:val="de-CH"/>
         </w:rPr>
-        <w:t>kanban</w:t>
-      </w:r>
-      <w:proofErr w:type="spellEnd"/>
+        <w:t>N</w:t>
+      </w:r>
       <w:r>
         <w:rPr>
           <w:lang w:val="de-CH"/>
         </w:rPr>
-        <w:t xml:space="preserve"> (</w:t>
-      </w:r>
-      <w:proofErr w:type="spellStart"/>
-      <w:proofErr w:type="gramStart"/>
+        <w:t>otio</w:t>
+      </w:r>
       <w:r>
         <w:rPr>
           <w:lang w:val="de-CH"/>
         </w:rPr>
-        <w:t>notio</w:t>
+        <w:t>n</w:t>
       </w:r>
       <w:r>
         <w:rPr>
           <w:lang w:val="de-CH"/>
         </w:rPr>
-        <w:t>n</w:t>
-      </w:r>
-      <w:proofErr w:type="spellEnd"/>
-      <w:r>
-        <w:rPr>
-          <w:lang w:val="de-CH"/>
-        </w:rPr>
-        <w:t>(</w:t>
-      </w:r>
-      <w:proofErr w:type="gramEnd"/>
+        <w:t>)</w:t>
+      </w:r>
     </w:p>
     <w:p>
       <w:r>
@@ -2356,10 +2362,16 @@
       <w:r>
         <w:t xml:space="preserve">Réaliser :  faire </w:t>
       </w:r>
+      <w:r>
+        <w:t>le projet</w:t>
+      </w:r>
     </w:p>
     <w:p>
       <w:r>
-        <w:t xml:space="preserve">Contrôler :  vérification des choses quoi </w:t>
+        <w:t>Contrôler :  vérification de</w:t>
+      </w:r>
+      <w:r>
+        <w:t xml:space="preserve"> la réalisation</w:t>
       </w:r>
     </w:p>
     <w:p>

</xml_diff>

<commit_message>
Avancement de la documentation
</commit_message>
<xml_diff>
--- a/documents/documents_word/documentation_projet_m431_v2.docx
+++ b/documents/documents_word/documentation_projet_m431_v2.docx
@@ -145,20 +145,8 @@
                                     <w:sz w:val="28"/>
                                     <w:szCs w:val="28"/>
                                   </w:rPr>
-                                  <w:t xml:space="preserve">Jonathan </w:t>
+                                  <w:t>Jonathan Ulveling</w:t>
                                 </w:r>
-                                <w:proofErr w:type="spellStart"/>
-                                <w:r>
-                                  <w:rPr>
-                                    <w:i/>
-                                    <w:iCs/>
-                                    <w:color w:val="4C94D8" w:themeColor="text2" w:themeTint="80"/>
-                                    <w:sz w:val="28"/>
-                                    <w:szCs w:val="28"/>
-                                  </w:rPr>
-                                  <w:t>Ulveling</w:t>
-                                </w:r>
-                                <w:proofErr w:type="spellEnd"/>
                               </w:p>
                             </w:txbxContent>
                           </wps:txbx>
@@ -186,7 +174,7 @@
                     <v:stroke joinstyle="miter"/>
                     <v:path gradientshapeok="t" o:connecttype="rect"/>
                   </v:shapetype>
-                  <v:shape id="Zone de texte 66" o:spid="_x0000_s1026" type="#_x0000_t202" style="position:absolute;margin-left:0;margin-top:0;width:468pt;height:1in;z-index:251661312;visibility:visible;mso-wrap-style:square;mso-width-percent:765;mso-height-percent:0;mso-wrap-distance-left:9pt;mso-wrap-distance-top:0;mso-wrap-distance-right:9pt;mso-wrap-distance-bottom:0;mso-position-horizontal:center;mso-position-horizontal-relative:page;mso-position-vertical:top;mso-position-vertical-relative:margin;mso-width-percent:765;mso-height-percent:0;mso-width-relative:page;mso-height-relative:margin;v-text-anchor:top" o:gfxdata="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" filled="f" stroked="f" strokeweight=".5pt">
+                  <v:shape id="Zone de texte 66" o:spid="_x0000_s1026" type="#_x0000_t202" style="position:absolute;margin-left:0;margin-top:0;width:468pt;height:1in;z-index:251661312;visibility:visible;mso-wrap-style:square;mso-width-percent:765;mso-height-percent:0;mso-wrap-distance-left:9pt;mso-wrap-distance-top:0;mso-wrap-distance-right:9pt;mso-wrap-distance-bottom:0;mso-position-horizontal:center;mso-position-horizontal-relative:page;mso-position-vertical:top;mso-position-vertical-relative:margin;mso-width-percent:765;mso-height-percent:0;mso-width-relative:page;mso-height-relative:margin;v-text-anchor:top" o:gfxdata="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" filled="f" stroked="f" strokeweight=".5pt">
                     <v:textbox style="mso-fit-shape-to-text:t">
                       <w:txbxContent>
                         <w:sdt>
@@ -247,20 +235,8 @@
                               <w:sz w:val="28"/>
                               <w:szCs w:val="28"/>
                             </w:rPr>
-                            <w:t xml:space="preserve">Jonathan </w:t>
+                            <w:t>Jonathan Ulveling</w:t>
                           </w:r>
-                          <w:proofErr w:type="spellStart"/>
-                          <w:r>
-                            <w:rPr>
-                              <w:i/>
-                              <w:iCs/>
-                              <w:color w:val="4C94D8" w:themeColor="text2" w:themeTint="80"/>
-                              <w:sz w:val="28"/>
-                              <w:szCs w:val="28"/>
-                            </w:rPr>
-                            <w:t>Ulveling</w:t>
-                          </w:r>
-                          <w:proofErr w:type="spellEnd"/>
                         </w:p>
                       </w:txbxContent>
                     </v:textbox>
@@ -897,25 +873,7 @@
                                         <w:sz w:val="36"/>
                                         <w:szCs w:val="36"/>
                                       </w:rPr>
-                                      <w:t xml:space="preserve"> / Jonathan Calvino / Kevin </w:t>
-                                    </w:r>
-                                    <w:proofErr w:type="spellStart"/>
-                                    <w:r>
-                                      <w:rPr>
-                                        <w:color w:val="156082" w:themeColor="accent1"/>
-                                        <w:sz w:val="36"/>
-                                        <w:szCs w:val="36"/>
-                                      </w:rPr>
-                                      <w:t>Thuraisingam</w:t>
-                                    </w:r>
-                                    <w:proofErr w:type="spellEnd"/>
-                                    <w:r>
-                                      <w:rPr>
-                                        <w:color w:val="156082" w:themeColor="accent1"/>
-                                        <w:sz w:val="36"/>
-                                        <w:szCs w:val="36"/>
-                                      </w:rPr>
-                                      <w:t xml:space="preserve"> / Rafael De Morais</w:t>
+                                      <w:t xml:space="preserve"> / Jonathan Calvino / Kevin Thuraisingam / Rafael De Morais</w:t>
                                     </w:r>
                                   </w:sdtContent>
                                 </w:sdt>
@@ -977,7 +935,7 @@
               </mc:Choice>
               <mc:Fallback>
                 <w:pict>
-                  <v:shape w14:anchorId="0E18D306" id="Zone de texte 73" o:spid="_x0000_s1027" type="#_x0000_t202" style="position:absolute;margin-left:0;margin-top:0;width:468pt;height:29.5pt;z-index:251659264;visibility:visible;mso-wrap-style:square;mso-width-percent:765;mso-height-percent:0;mso-wrap-distance-left:9pt;mso-wrap-distance-top:0;mso-wrap-distance-right:9pt;mso-wrap-distance-bottom:0;mso-position-horizontal:center;mso-position-horizontal-relative:page;mso-position-vertical:bottom;mso-position-vertical-relative:margin;mso-width-percent:765;mso-height-percent:0;mso-width-relative:page;mso-height-relative:margin;v-text-anchor:bottom" o:gfxdata="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" filled="f" stroked="f" strokeweight=".5pt">
+                  <v:shape w14:anchorId="0E18D306" id="Zone de texte 73" o:spid="_x0000_s1027" type="#_x0000_t202" style="position:absolute;margin-left:0;margin-top:0;width:468pt;height:29.5pt;z-index:251659264;visibility:visible;mso-wrap-style:square;mso-width-percent:765;mso-height-percent:0;mso-wrap-distance-left:9pt;mso-wrap-distance-top:0;mso-wrap-distance-right:9pt;mso-wrap-distance-bottom:0;mso-position-horizontal:center;mso-position-horizontal-relative:page;mso-position-vertical:bottom;mso-position-vertical-relative:margin;mso-width-percent:765;mso-height-percent:0;mso-width-relative:page;mso-height-relative:margin;v-text-anchor:bottom" o:gfxdata="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" filled="f" stroked="f" strokeweight=".5pt">
                     <v:textbox style="mso-fit-shape-to-text:t" inset="0,0,0,0">
                       <w:txbxContent>
                         <w:p>
@@ -1018,25 +976,7 @@
                                   <w:sz w:val="36"/>
                                   <w:szCs w:val="36"/>
                                 </w:rPr>
-                                <w:t xml:space="preserve"> / Jonathan Calvino / Kevin </w:t>
-                              </w:r>
-                              <w:proofErr w:type="spellStart"/>
-                              <w:r>
-                                <w:rPr>
-                                  <w:color w:val="156082" w:themeColor="accent1"/>
-                                  <w:sz w:val="36"/>
-                                  <w:szCs w:val="36"/>
-                                </w:rPr>
-                                <w:t>Thuraisingam</w:t>
-                              </w:r>
-                              <w:proofErr w:type="spellEnd"/>
-                              <w:r>
-                                <w:rPr>
-                                  <w:color w:val="156082" w:themeColor="accent1"/>
-                                  <w:sz w:val="36"/>
-                                  <w:szCs w:val="36"/>
-                                </w:rPr>
-                                <w:t xml:space="preserve"> / Rafael De Morais</w:t>
+                                <w:t xml:space="preserve"> / Jonathan Calvino / Kevin Thuraisingam / Rafael De Morais</w:t>
                               </w:r>
                             </w:sdtContent>
                           </w:sdt>
@@ -2253,131 +2193,661 @@
       </w:r>
     </w:p>
     <w:p>
-      <w:pPr>
-        <w:rPr>
-          <w:lang w:val="de-CH"/>
-        </w:rPr>
-      </w:pPr>
+      <w:r>
+        <w:t>Planif</w:t>
+      </w:r>
+      <w:r>
+        <w:t>i</w:t>
+      </w:r>
+      <w:r>
+        <w:t xml:space="preserve">er : diagramme </w:t>
+      </w:r>
+      <w:r>
+        <w:t>Gantt,</w:t>
+      </w:r>
+      <w:r>
+        <w:t xml:space="preserve"> </w:t>
+      </w:r>
+      <w:r>
+        <w:t>Kanban</w:t>
+      </w:r>
+      <w:r>
+        <w:t xml:space="preserve"> (</w:t>
+      </w:r>
+      <w:r>
+        <w:t>N</w:t>
+      </w:r>
+      <w:r>
+        <w:t>otion</w:t>
+      </w:r>
+      <w:r>
+        <w:t>)</w:t>
+      </w:r>
+    </w:p>
+    <w:p>
+      <w:r>
+        <w:t xml:space="preserve">Décider : attribution des taches ressources </w:t>
+      </w:r>
+    </w:p>
+    <w:p>
+      <w:r>
+        <w:t xml:space="preserve">Réaliser :  faire </w:t>
+      </w:r>
+      <w:r>
+        <w:t>le projet</w:t>
+      </w:r>
+    </w:p>
+    <w:p>
+      <w:r>
+        <w:t>Contrôler :  vérification de</w:t>
+      </w:r>
+      <w:r>
+        <w:t xml:space="preserve"> la réalisation</w:t>
+      </w:r>
+    </w:p>
+    <w:p>
+      <w:r>
+        <w:t xml:space="preserve">Valider : validation finale </w:t>
+      </w:r>
+    </w:p>
+    <w:p>
+      <w:pPr>
+        <w:pStyle w:val="Titre1"/>
+      </w:pPr>
+      <w:r>
+        <w:lastRenderedPageBreak/>
+        <w:t xml:space="preserve">Matrice d’Eisenhower </w:t>
+      </w:r>
+    </w:p>
+    <w:p>
+      <w:pPr>
+        <w:rPr>
+          <w:rFonts w:asciiTheme="majorHAnsi" w:eastAsiaTheme="majorEastAsia" w:hAnsiTheme="majorHAnsi" w:cstheme="majorBidi"/>
+          <w:color w:val="0F4761" w:themeColor="accent1" w:themeShade="BF"/>
+          <w:sz w:val="40"/>
+          <w:szCs w:val="40"/>
+          <w:lang w:val="fr-FR"/>
+        </w:rPr>
+      </w:pPr>
+      <w:r>
+        <w:br w:type="page"/>
+      </w:r>
+    </w:p>
+    <w:p>
+      <w:pPr>
+        <w:pStyle w:val="Titre1"/>
+      </w:pPr>
+      <w:r>
+        <w:lastRenderedPageBreak/>
+        <w:t>Liste de</w:t>
+      </w:r>
+      <w:r>
+        <w:t xml:space="preserve">s taches </w:t>
+      </w:r>
+    </w:p>
+    <w:p>
+      <w:pPr>
+        <w:rPr>
+          <w:lang w:val="fr-FR"/>
+        </w:rPr>
+      </w:pPr>
+      <w:r>
+        <w:rPr>
+          <w:lang w:val="fr-FR"/>
+        </w:rPr>
+        <w:t>L’apprentissage des outils</w:t>
+      </w:r>
+      <w:r>
+        <w:rPr>
+          <w:lang w:val="fr-FR"/>
+        </w:rPr>
+        <w:t xml:space="preserve"> : </w:t>
+      </w:r>
+      <w:r>
+        <w:rPr>
+          <w:lang w:val="fr-FR"/>
+        </w:rPr>
+        <w:t xml:space="preserve">Apprentissage, </w:t>
+      </w:r>
       <w:proofErr w:type="spellStart"/>
       <w:r>
         <w:rPr>
-          <w:lang w:val="de-CH"/>
-        </w:rPr>
-        <w:t>Planif</w:t>
-      </w:r>
-      <w:r>
-        <w:rPr>
-          <w:lang w:val="de-CH"/>
+          <w:lang w:val="fr-FR"/>
+        </w:rPr>
+        <w:t>Git+VS</w:t>
+      </w:r>
+      <w:proofErr w:type="spellEnd"/>
+      <w:r>
+        <w:rPr>
+          <w:lang w:val="fr-FR"/>
+        </w:rPr>
+        <w:t xml:space="preserve"> Code, GitHub et </w:t>
+      </w:r>
+      <w:r>
+        <w:rPr>
+          <w:lang w:val="fr-FR"/>
+        </w:rPr>
+        <w:t>présentation Responsable</w:t>
+      </w:r>
+      <w:r>
+        <w:rPr>
+          <w:lang w:val="fr-FR"/>
+        </w:rPr>
+        <w:t xml:space="preserve"> : tous </w:t>
+      </w:r>
+    </w:p>
+    <w:p>
+      <w:pPr>
+        <w:rPr>
+          <w:lang w:val="fr-FR"/>
+        </w:rPr>
+      </w:pPr>
+      <w:r>
+        <w:rPr>
+          <w:lang w:val="fr-FR"/>
+        </w:rPr>
+        <w:t>Planification des taches</w:t>
+      </w:r>
+      <w:r>
+        <w:rPr>
+          <w:lang w:val="fr-FR"/>
+        </w:rPr>
+        <w:t> :</w:t>
+      </w:r>
+      <w:r>
+        <w:rPr>
+          <w:lang w:val="fr-FR"/>
+        </w:rPr>
+        <w:t xml:space="preserve"> Kanban, Gantt </w:t>
+      </w:r>
+      <w:r>
+        <w:rPr>
+          <w:lang w:val="fr-FR"/>
+        </w:rPr>
+        <w:t xml:space="preserve">prévisionnel et final </w:t>
+      </w:r>
+      <w:r>
+        <w:rPr>
+          <w:lang w:val="fr-FR"/>
+        </w:rPr>
+        <w:t xml:space="preserve">                       </w:t>
+      </w:r>
+      <w:r>
+        <w:rPr>
+          <w:lang w:val="fr-FR"/>
+        </w:rPr>
+        <w:t xml:space="preserve">             </w:t>
+      </w:r>
+      <w:r>
+        <w:rPr>
+          <w:lang w:val="fr-FR"/>
+        </w:rPr>
+        <w:t xml:space="preserve">    </w:t>
+      </w:r>
+      <w:r>
+        <w:rPr>
+          <w:lang w:val="fr-FR"/>
+        </w:rPr>
+        <w:t>responsable</w:t>
+      </w:r>
+      <w:r>
+        <w:rPr>
+          <w:lang w:val="fr-FR"/>
+        </w:rPr>
+        <w:t xml:space="preserve"> : Jonathan</w:t>
+      </w:r>
+      <w:r>
+        <w:rPr>
+          <w:lang w:val="fr-FR"/>
+        </w:rPr>
+        <w:t xml:space="preserve">                                                                                                                                                                  </w:t>
+      </w:r>
+    </w:p>
+    <w:p>
+      <w:pPr>
+        <w:rPr>
+          <w:lang w:val="fr-FR"/>
+        </w:rPr>
+      </w:pPr>
+      <w:r>
+        <w:rPr>
+          <w:lang w:val="fr-FR"/>
+        </w:rPr>
+        <w:t>Les diagrammes</w:t>
+      </w:r>
+      <w:r>
+        <w:rPr>
+          <w:lang w:val="fr-FR"/>
+        </w:rPr>
+        <w:t> : Eisenhower, Gantt prévisionnel</w:t>
+      </w:r>
+      <w:r>
+        <w:rPr>
+          <w:lang w:val="fr-FR"/>
+        </w:rPr>
+        <w:t>, Gantt final</w:t>
+      </w:r>
+      <w:r>
+        <w:rPr>
+          <w:lang w:val="fr-FR"/>
+        </w:rPr>
+        <w:tab/>
+      </w:r>
+      <w:r>
+        <w:rPr>
+          <w:lang w:val="fr-FR"/>
+        </w:rPr>
+        <w:t xml:space="preserve">                                                responsable :</w:t>
+      </w:r>
+      <w:r>
+        <w:rPr>
+          <w:lang w:val="fr-FR"/>
+        </w:rPr>
+        <w:t xml:space="preserve">Rafael </w:t>
+      </w:r>
+      <w:r>
+        <w:rPr>
+          <w:lang w:val="fr-FR"/>
+        </w:rPr>
+        <w:t xml:space="preserve">                                                                                                                                                                                                                                                                                                                                                                                                                                                        </w:t>
+      </w:r>
+    </w:p>
+    <w:p>
+      <w:pPr>
+        <w:rPr>
+          <w:lang w:val="fr-FR"/>
+        </w:rPr>
+      </w:pPr>
+      <w:r>
+        <w:rPr>
+          <w:lang w:val="fr-FR"/>
+        </w:rPr>
+        <w:t>La documentation</w:t>
+      </w:r>
+      <w:r>
+        <w:rPr>
+          <w:lang w:val="fr-FR"/>
+        </w:rPr>
+        <w:t> : Documentation</w:t>
+      </w:r>
+      <w:r>
+        <w:rPr>
+          <w:lang w:val="fr-FR"/>
+        </w:rPr>
+        <w:t>, GitHub Pages, W</w:t>
+      </w:r>
+      <w:r>
+        <w:rPr>
+          <w:lang w:val="fr-FR"/>
         </w:rPr>
         <w:t>i</w:t>
       </w:r>
       <w:r>
         <w:rPr>
-          <w:lang w:val="de-CH"/>
-        </w:rPr>
-        <w:t>er</w:t>
-      </w:r>
-      <w:proofErr w:type="spellEnd"/>
-      <w:r>
-        <w:rPr>
-          <w:lang w:val="de-CH"/>
-        </w:rPr>
-        <w:t xml:space="preserve"> : </w:t>
-      </w:r>
-      <w:proofErr w:type="spellStart"/>
-      <w:r>
-        <w:rPr>
-          <w:lang w:val="de-CH"/>
-        </w:rPr>
-        <w:t>diagramme</w:t>
-      </w:r>
-      <w:proofErr w:type="spellEnd"/>
-      <w:r>
-        <w:rPr>
-          <w:lang w:val="de-CH"/>
+          <w:lang w:val="fr-FR"/>
+        </w:rPr>
+        <w:t>ki</w:t>
+      </w:r>
+      <w:r>
+        <w:rPr>
+          <w:lang w:val="fr-FR"/>
+        </w:rPr>
+        <w:t xml:space="preserve">                                                                                               responsable</w:t>
+      </w:r>
+      <w:r>
+        <w:rPr>
+          <w:lang w:val="fr-FR"/>
+        </w:rPr>
+        <w:t> : Kevin</w:t>
+      </w:r>
+    </w:p>
+    <w:p>
+      <w:pPr>
+        <w:pStyle w:val="Sous-titre"/>
+      </w:pPr>
+      <w:r>
+        <w:t>Description</w:t>
+      </w:r>
+    </w:p>
+    <w:p>
+      <w:pPr>
+        <w:rPr>
+          <w:lang w:val="fr-FR"/>
+        </w:rPr>
+      </w:pPr>
+      <w:r>
+        <w:rPr>
+          <w:lang w:val="fr-FR"/>
+        </w:rPr>
+        <w:t>Pour la planification nous allons</w:t>
+      </w:r>
+      <w:r>
+        <w:rPr>
+          <w:lang w:val="fr-FR"/>
+        </w:rPr>
+        <w:t xml:space="preserve"> utiliser kanban pour la </w:t>
+      </w:r>
+      <w:r>
+        <w:rPr>
+          <w:lang w:val="fr-FR"/>
+        </w:rPr>
+        <w:t>distribution</w:t>
+      </w:r>
+      <w:r>
+        <w:rPr>
+          <w:lang w:val="fr-FR"/>
+        </w:rPr>
+        <w:t xml:space="preserve"> des taches et l’état d’avancées des </w:t>
+      </w:r>
+      <w:r>
+        <w:rPr>
+          <w:lang w:val="fr-FR"/>
+        </w:rPr>
+        <w:t>différentes étapes</w:t>
+      </w:r>
+      <w:r>
+        <w:rPr>
+          <w:lang w:val="fr-FR"/>
+        </w:rPr>
+        <w:t xml:space="preserve">, Gantt lui </w:t>
+      </w:r>
+      <w:r>
+        <w:rPr>
+          <w:lang w:val="fr-FR"/>
+        </w:rPr>
+        <w:t>va nous être util</w:t>
+      </w:r>
+      <w:r>
+        <w:rPr>
+          <w:lang w:val="fr-FR"/>
+        </w:rPr>
+        <w:t xml:space="preserve">e </w:t>
+      </w:r>
+      <w:r>
+        <w:rPr>
+          <w:lang w:val="fr-FR"/>
+        </w:rPr>
+        <w:t>pour</w:t>
+      </w:r>
+      <w:r>
+        <w:rPr>
+          <w:lang w:val="fr-FR"/>
+        </w:rPr>
+        <w:t xml:space="preserve"> voir </w:t>
+      </w:r>
+      <w:r>
+        <w:rPr>
+          <w:lang w:val="fr-FR"/>
+        </w:rPr>
+        <w:t>leur durée</w:t>
+      </w:r>
+      <w:r>
+        <w:rPr>
+          <w:lang w:val="fr-FR"/>
         </w:rPr>
         <w:t xml:space="preserve"> </w:t>
       </w:r>
       <w:r>
         <w:rPr>
-          <w:lang w:val="de-CH"/>
-        </w:rPr>
-        <w:t>Gant</w:t>
-      </w:r>
-      <w:r>
-        <w:rPr>
-          <w:lang w:val="de-CH"/>
-        </w:rPr>
-        <w:t>t,</w:t>
-      </w:r>
-      <w:r>
-        <w:rPr>
-          <w:lang w:val="de-CH"/>
+          <w:lang w:val="fr-FR"/>
+        </w:rPr>
+        <w:t>estimée</w:t>
+      </w:r>
+      <w:r>
+        <w:rPr>
+          <w:lang w:val="fr-FR"/>
         </w:rPr>
         <w:t xml:space="preserve"> </w:t>
       </w:r>
       <w:r>
         <w:rPr>
-          <w:lang w:val="de-CH"/>
-        </w:rPr>
-        <w:t>Kanban</w:t>
-      </w:r>
-      <w:r>
-        <w:rPr>
-          <w:lang w:val="de-CH"/>
-        </w:rPr>
-        <w:t xml:space="preserve"> (</w:t>
-      </w:r>
-      <w:r>
-        <w:rPr>
-          <w:lang w:val="de-CH"/>
-        </w:rPr>
-        <w:t>N</w:t>
-      </w:r>
-      <w:r>
-        <w:rPr>
-          <w:lang w:val="de-CH"/>
-        </w:rPr>
-        <w:t>otio</w:t>
-      </w:r>
-      <w:r>
-        <w:rPr>
-          <w:lang w:val="de-CH"/>
-        </w:rPr>
-        <w:t>n</w:t>
-      </w:r>
-      <w:r>
-        <w:rPr>
-          <w:lang w:val="de-CH"/>
+          <w:lang w:val="fr-FR"/>
+        </w:rPr>
+        <w:t>dans le temps</w:t>
+      </w:r>
+      <w:r>
+        <w:rPr>
+          <w:lang w:val="fr-FR"/>
+        </w:rPr>
+        <w:t xml:space="preserve"> </w:t>
+      </w:r>
+      <w:r>
+        <w:rPr>
+          <w:lang w:val="fr-FR"/>
+        </w:rPr>
+        <w:t xml:space="preserve">(Gantt </w:t>
+      </w:r>
+      <w:r>
+        <w:rPr>
+          <w:lang w:val="fr-FR"/>
+        </w:rPr>
+        <w:t>prévisionnel</w:t>
+      </w:r>
+      <w:r>
+        <w:rPr>
+          <w:lang w:val="fr-FR"/>
         </w:rPr>
         <w:t>)</w:t>
       </w:r>
-    </w:p>
-    <w:p>
-      <w:r>
-        <w:t xml:space="preserve">Décider : attribution des taches ressources </w:t>
-      </w:r>
-    </w:p>
-    <w:p>
-      <w:r>
-        <w:t xml:space="preserve">Réaliser :  faire </w:t>
-      </w:r>
-      <w:r>
-        <w:t>le projet</w:t>
-      </w:r>
-    </w:p>
-    <w:p>
-      <w:r>
-        <w:t>Contrôler :  vérification de</w:t>
-      </w:r>
-      <w:r>
-        <w:t xml:space="preserve"> la réalisation</w:t>
-      </w:r>
-    </w:p>
-    <w:p>
-      <w:r>
-        <w:t xml:space="preserve">Valider : validation finale </w:t>
-      </w:r>
+      <w:r>
+        <w:rPr>
+          <w:lang w:val="fr-FR"/>
+        </w:rPr>
+        <w:t xml:space="preserve"> </w:t>
+      </w:r>
+      <w:r>
+        <w:rPr>
+          <w:lang w:val="fr-FR"/>
+        </w:rPr>
+        <w:t>et leurs dépendance</w:t>
+      </w:r>
+      <w:r>
+        <w:rPr>
+          <w:lang w:val="fr-FR"/>
+        </w:rPr>
+        <w:t>s</w:t>
+      </w:r>
+      <w:r>
+        <w:rPr>
+          <w:lang w:val="fr-FR"/>
+        </w:rPr>
+        <w:t>.</w:t>
+      </w:r>
+      <w:r>
+        <w:rPr>
+          <w:lang w:val="fr-FR"/>
+        </w:rPr>
+        <w:t xml:space="preserve"> Le Gantt </w:t>
+      </w:r>
+      <w:r>
+        <w:rPr>
+          <w:lang w:val="fr-FR"/>
+        </w:rPr>
+        <w:t xml:space="preserve">réel lui, donnera la durée réelle de chaque </w:t>
+      </w:r>
+      <w:r>
+        <w:rPr>
+          <w:lang w:val="fr-FR"/>
+        </w:rPr>
+        <w:t>tache</w:t>
+      </w:r>
+      <w:r>
+        <w:rPr>
+          <w:lang w:val="fr-FR"/>
+        </w:rPr>
+        <w:t xml:space="preserve"> tout en gardant les </w:t>
+      </w:r>
+      <w:r>
+        <w:rPr>
+          <w:lang w:val="fr-FR"/>
+        </w:rPr>
+        <w:t xml:space="preserve">mêmes dépendances que dans le Gantt </w:t>
+      </w:r>
+      <w:r>
+        <w:rPr>
+          <w:lang w:val="fr-FR"/>
+        </w:rPr>
+        <w:t>prévisionnel.</w:t>
+      </w:r>
+    </w:p>
+    <w:p>
+      <w:pPr>
+        <w:rPr>
+          <w:lang w:val="fr-FR"/>
+        </w:rPr>
+      </w:pPr>
+      <w:r>
+        <w:rPr>
+          <w:lang w:val="fr-FR"/>
+        </w:rPr>
+        <w:t>Eisenhower</w:t>
+      </w:r>
+      <w:r>
+        <w:rPr>
+          <w:lang w:val="fr-FR"/>
+        </w:rPr>
+        <w:t xml:space="preserve"> </w:t>
+      </w:r>
+      <w:r>
+        <w:rPr>
+          <w:lang w:val="fr-FR"/>
+        </w:rPr>
+        <w:t>va être utilisé pour classer les taches par leur importance et leurs urgences.</w:t>
+      </w:r>
+    </w:p>
+    <w:p>
+      <w:pPr>
+        <w:rPr>
+          <w:lang w:val="fr-FR"/>
+        </w:rPr>
+      </w:pPr>
+      <w:r>
+        <w:rPr>
+          <w:lang w:val="fr-FR"/>
+        </w:rPr>
+        <w:t>Nous</w:t>
+      </w:r>
+      <w:r>
+        <w:rPr>
+          <w:lang w:val="fr-FR"/>
+        </w:rPr>
+        <w:t xml:space="preserve"> allons </w:t>
+      </w:r>
+      <w:r>
+        <w:rPr>
+          <w:lang w:val="fr-FR"/>
+        </w:rPr>
+        <w:t xml:space="preserve">aussi </w:t>
+      </w:r>
+      <w:r>
+        <w:rPr>
+          <w:lang w:val="fr-FR"/>
+        </w:rPr>
+        <w:t>prendre le temps d’apprendre à utiliser les outils Git et Visual Studio GitHub va nous servir à centraliser nos documents et y accéder</w:t>
+      </w:r>
+      <w:r>
+        <w:rPr>
+          <w:lang w:val="fr-FR"/>
+        </w:rPr>
+        <w:t>.</w:t>
+      </w:r>
+    </w:p>
+    <w:p>
+      <w:pPr>
+        <w:rPr>
+          <w:lang w:val="fr-FR"/>
+        </w:rPr>
+      </w:pPr>
+      <w:r>
+        <w:rPr>
+          <w:lang w:val="fr-FR"/>
+        </w:rPr>
+        <w:t>GitHub</w:t>
+      </w:r>
+      <w:r>
+        <w:rPr>
+          <w:lang w:val="fr-FR"/>
+        </w:rPr>
+        <w:t xml:space="preserve"> </w:t>
+      </w:r>
+      <w:r>
+        <w:rPr>
+          <w:lang w:val="fr-FR"/>
+        </w:rPr>
+        <w:t>P</w:t>
+      </w:r>
+      <w:r>
+        <w:rPr>
+          <w:lang w:val="fr-FR"/>
+        </w:rPr>
+        <w:t>ages va être notre wiki qui va être le tutoriel pour utiliser notre outil et obtenir son certificat SSL.</w:t>
+      </w:r>
+      <w:r>
+        <w:rPr>
+          <w:lang w:val="fr-FR"/>
+        </w:rPr>
+        <w:t xml:space="preserve"> </w:t>
+      </w:r>
+      <w:r>
+        <w:rPr>
+          <w:lang w:val="fr-FR"/>
+        </w:rPr>
+        <w:t>La documentation va être le document final à rendre avec tout</w:t>
+      </w:r>
+      <w:r>
+        <w:rPr>
+          <w:lang w:val="fr-FR"/>
+        </w:rPr>
+        <w:t xml:space="preserve"> ce qui a été fait pour le projet</w:t>
+      </w:r>
+    </w:p>
+    <w:p>
+      <w:pPr>
+        <w:pStyle w:val="Sous-titre"/>
+        <w:rPr>
+          <w:lang w:val="fr-FR"/>
+        </w:rPr>
+      </w:pPr>
+      <w:r>
+        <w:rPr>
+          <w:lang w:val="fr-FR"/>
+        </w:rPr>
+        <w:t xml:space="preserve">Durée </w:t>
+      </w:r>
+      <w:r>
+        <w:rPr>
+          <w:lang w:val="fr-FR"/>
+        </w:rPr>
+        <w:t>estimée :</w:t>
+      </w:r>
+    </w:p>
+    <w:p>
+      <w:pPr>
+        <w:rPr>
+          <w:lang w:val="fr-FR"/>
+        </w:rPr>
+      </w:pPr>
+    </w:p>
+    <w:p>
+      <w:pPr>
+        <w:rPr>
+          <w:lang w:val="fr-FR"/>
+        </w:rPr>
+      </w:pPr>
+    </w:p>
+    <w:p>
+      <w:pPr>
+        <w:rPr>
+          <w:lang w:val="fr-FR"/>
+        </w:rPr>
+      </w:pPr>
+    </w:p>
+    <w:p>
+      <w:pPr>
+        <w:rPr>
+          <w:lang w:val="fr-FR"/>
+        </w:rPr>
+      </w:pPr>
     </w:p>
     <w:sectPr>
       <w:headerReference w:type="default" r:id="rId8"/>
@@ -2517,7 +2987,7 @@
       <w:rPr>
         <w:noProof/>
       </w:rPr>
-      <w:t>02.04.2026</w:t>
+      <w:t>23.04.2026</w:t>
     </w:r>
     <w:r>
       <w:fldChar w:fldCharType="end"/>

</xml_diff>